<commit_message>
Update final report docx.
</commit_message>
<xml_diff>
--- a/deliverables/final_report.docx
+++ b/deliverables/final_report.docx
@@ -857,6 +857,29 @@
         <w:pStyle w:val="Heading1"/>
       </w:pPr>
       <w:r>
+        <w:t>Lessons Learned</w:t>
+      </w:r>
+    </w:p>
+    <w:p>
+      <w:r>
+        <w:t>One lesson from the project is that clean project structure matters almost as much as the clustering result itself. Once the data preparation, model execution, reporting, and tests were organized into clear modules, it became much easier to reason about the analysis and to regenerate the final outputs reliably.</w:t>
+      </w:r>
+    </w:p>
+    <w:p>
+      <w:r>
+        <w:t>A second lesson is that mixed results are still meaningful results. The presence of a mixed malicious-heavy cluster does not weaken the project; instead, it highlights the fact that real cybersecurity analysis often lives in gray areas rather than in perfect separations.</w:t>
+      </w:r>
+    </w:p>
+    <w:p>
+      <w:r>
+        <w:t>A third lesson is that packaging matters. Turning the project into a final report, slide deck, and submission archive forced the workflow to become more reproducible and more communicable. That is a valuable outcome on its own because strong cybersecurity work has to be explainable to other people, not just runnable by its original author.</w:t>
+      </w:r>
+    </w:p>
+    <w:p>
+      <w:pPr>
+        <w:pStyle w:val="Heading1"/>
+      </w:pPr>
+      <w:r>
         <w:t>Conclusion</w:t>
       </w:r>
     </w:p>

</xml_diff>